<commit_message>
feat(courseware): v2.3 — knowledge before every lab, Telegram chatbot demo, Lab N workflow names
- Topic 2 re-sequenced: agentic chatbot concepts + Telegram demo -> Lab 3 -> human in the loop
  and guardrails -> Lab 4; the LG prints "Key Concepts for Lab N" directly before each lab and
  the LP Day 2 timetable follows the same order
- Telegram HR chatbot demo before Lab 3: BotFather /newbot, build with n8n Assistant from one
  prompt, connect, publish and chat (reference solution in labs/lab3-chatbot-webhook/)
- Agent loop slide redrawn as Context -> Plan -> Action -> Verify and repeat
- Real n8n canvas screenshots for Lab 2, Lab 3 and the demo
- Workflow JSON files and n8n names renamed to "Lab N - <description>" (old LU/Activity labels removed)
- Knowledge -> Lab hard rule added to the slide skills
- Public deck built with PUBLIC_BUILD=1 (no training-account password)

Co-Authored-By: Claude Opus 5.5 <noreply@anthropic.com>
</commit_message>
<xml_diff>
--- a/courseware/LP-Agentic AI for Business Process Automation.docx
+++ b/courseware/LP-Agentic AI for Business Process Automation.docx
@@ -218,7 +218,7 @@
           <w:color w:val="1F6FEB"/>
           <w:sz w:val="24"/>
         </w:rPr>
-        <w:t>Version 2.1</w:t>
+        <w:t>Version 2.3</w:t>
       </w:r>
     </w:p>
     <w:p>
@@ -612,6 +612,122 @@
           </w:p>
         </w:tc>
       </w:tr>
+      <w:tr>
+        <w:tc>
+          <w:tcPr>
+            <w:tcW w:type="dxa" w:w="2160"/>
+          </w:tcPr>
+          <w:p>
+            <w:r/>
+            <w:r>
+              <w:rPr>
+                <w:sz w:val="19"/>
+              </w:rPr>
+              <w:t>2.2</w:t>
+            </w:r>
+          </w:p>
+        </w:tc>
+        <w:tc>
+          <w:tcPr>
+            <w:tcW w:type="dxa" w:w="2160"/>
+          </w:tcPr>
+          <w:p>
+            <w:r/>
+            <w:r>
+              <w:rPr>
+                <w:sz w:val="19"/>
+              </w:rPr>
+              <w:t>15 October 2026</w:t>
+            </w:r>
+          </w:p>
+        </w:tc>
+        <w:tc>
+          <w:tcPr>
+            <w:tcW w:type="dxa" w:w="2160"/>
+          </w:tcPr>
+          <w:p>
+            <w:r/>
+            <w:r>
+              <w:rPr>
+                <w:sz w:val="19"/>
+              </w:rPr>
+              <w:t>Topic 1 re-sequenced so each lab follows the concepts it needs: n8n fundamentals, then Lab 1, then the AI agent building blocks (AI agent, model, tools and MCP, instructions, memory) and webhooks, then Lab 2. Lab 1 now covers publishing the workflow, copying the form’s Production URL and creating a QR-code flyer, with step screenshots and flyers from previous learners. Lab 2 opens with how the building blocks fit together. Platform tiers updated for AI-assisted low-code and AI-generated full-code. New LMS login screenshot; Publish replaces the retired Active toggle. Schedule and slide references updated.</w:t>
+            </w:r>
+          </w:p>
+        </w:tc>
+        <w:tc>
+          <w:tcPr>
+            <w:tcW w:type="dxa" w:w="2160"/>
+          </w:tcPr>
+          <w:p>
+            <w:r/>
+            <w:r>
+              <w:rPr>
+                <w:sz w:val="19"/>
+              </w:rPr>
+              <w:t>Dr. Alfred Ang</w:t>
+            </w:r>
+          </w:p>
+        </w:tc>
+      </w:tr>
+      <w:tr>
+        <w:tc>
+          <w:tcPr>
+            <w:tcW w:type="dxa" w:w="2160"/>
+          </w:tcPr>
+          <w:p>
+            <w:r/>
+            <w:r>
+              <w:rPr>
+                <w:sz w:val="19"/>
+              </w:rPr>
+              <w:t>2.3</w:t>
+            </w:r>
+          </w:p>
+        </w:tc>
+        <w:tc>
+          <w:tcPr>
+            <w:tcW w:type="dxa" w:w="2160"/>
+          </w:tcPr>
+          <w:p>
+            <w:r/>
+            <w:r>
+              <w:rPr>
+                <w:sz w:val="19"/>
+              </w:rPr>
+              <w:t>16 October 2026</w:t>
+            </w:r>
+          </w:p>
+        </w:tc>
+        <w:tc>
+          <w:tcPr>
+            <w:tcW w:type="dxa" w:w="2160"/>
+          </w:tcPr>
+          <w:p>
+            <w:r/>
+            <w:r>
+              <w:rPr>
+                <w:sz w:val="19"/>
+              </w:rPr>
+              <w:t>Every lab now follows the knowledge it needs. Topic 2 is taught in two blocks: rule-based vs agentic workflows, designing a safe agentic chatbot and a Telegram HR chatbot demo (BotFather /newbot, built with n8n Assistant from one prompt, then a live chat), then Lab 3; then human in, on and out of the loop, how an approval suspends a workflow, when to put a human in the loop and guardrails, then Lab 4. The agent loop is now explained as Context → Plan → Action → Verify and repeat. Lab workflow files and their n8n names are now 'Lab N - &lt;description&gt;', replacing the old LU/Activity names. Real n8n canvas screenshots added for Lab 2, Lab 3 and the Telegram demo, plus a live Telegram chat. Each lab's key concepts in the Learner Guide now sit directly before that lab. Day 2 schedule and slide references updated.</w:t>
+            </w:r>
+          </w:p>
+        </w:tc>
+        <w:tc>
+          <w:tcPr>
+            <w:tcW w:type="dxa" w:w="2160"/>
+          </w:tcPr>
+          <w:p>
+            <w:r/>
+            <w:r>
+              <w:rPr>
+                <w:sz w:val="19"/>
+              </w:rPr>
+              <w:t>Dr. Alfred Ang</w:t>
+            </w:r>
+          </w:p>
+        </w:tc>
+      </w:tr>
     </w:tbl>
     <w:p>
       <w:pPr>
@@ -648,7 +764,7 @@
         </w:rPr>
         <w:t>Course Information</w:t>
         <w:tab/>
-        <w:t>5</w:t>
+        <w:t>6</w:t>
       </w:r>
     </w:p>
     <w:p>
@@ -667,7 +783,7 @@
         </w:rPr>
         <w:t>Learning Outcomes</w:t>
         <w:tab/>
-        <w:t>5</w:t>
+        <w:t>6</w:t>
       </w:r>
     </w:p>
     <w:p>
@@ -686,7 +802,7 @@
         </w:rPr>
         <w:t>Skills Framework Alignment</w:t>
         <w:tab/>
-        <w:t>5</w:t>
+        <w:t>6</w:t>
       </w:r>
     </w:p>
     <w:p>
@@ -705,7 +821,7 @@
         </w:rPr>
         <w:t>Assessment</w:t>
         <w:tab/>
-        <w:t>5</w:t>
+        <w:t>6</w:t>
       </w:r>
     </w:p>
     <w:p>
@@ -724,7 +840,7 @@
         </w:rPr>
         <w:t>Course Schedule</w:t>
         <w:tab/>
-        <w:t>6</w:t>
+        <w:t>7</w:t>
       </w:r>
     </w:p>
     <w:p>
@@ -744,7 +860,7 @@
         </w:rPr>
         <w:t>Day 1 — n8n, AI Agents and Agentic Chatbots</w:t>
         <w:tab/>
-        <w:t>6</w:t>
+        <w:t>7</w:t>
       </w:r>
     </w:p>
     <w:p>
@@ -764,7 +880,7 @@
         </w:rPr>
         <w:t>Day 2 — Human in the Loop, RAG and Assessment</w:t>
         <w:tab/>
-        <w:t>7</w:t>
+        <w:t>8</w:t>
       </w:r>
     </w:p>
     <w:p>
@@ -783,7 +899,7 @@
         </w:rPr>
         <w:t>Lab Reference (aligned to topics and learning outcomes)</w:t>
         <w:tab/>
-        <w:t>8</w:t>
+        <w:t>10</w:t>
       </w:r>
     </w:p>
     <w:p>
@@ -1806,7 +1922,7 @@
                 <w:b/>
                 <w:sz w:val="19"/>
               </w:rPr>
-              <w:t>Topic 1 — Overview of n8n and AI Agents: why agentic AI, and why workflow first — a brief history of AI 2023–2026, agentic AI vs AI agents, workflow first vs agent first, AI-assisted workflow creation with n8n Assistant, claiming the free AI credits, a demo that builds a social media campaign workflow from one prompt, the five principles of AI security, business value, use cases and platform tiers. Slides 20–36</w:t>
+              <w:t>Topic 1 — Overview of n8n and AI Agents: why agentic AI, and why workflow first — a brief history of AI 2023–2026, generative AI vs agentic AI, agentic AI vs AI agents, workflow first vs agent first, AI-assisted workflow creation, platform tiers (no-code, AI-assisted low-code, AI-generated full-code), business value, use cases, the five principles of AI security, what n8n is, signing in to n8n, and a demo that builds a social media campaign workflow with n8n Assistant. Slides 20–36</w:t>
             </w:r>
           </w:p>
         </w:tc>
@@ -1878,7 +1994,7 @@
                 <w:b/>
                 <w:sz w:val="19"/>
               </w:rPr>
-              <w:t>11:15–12:30</w:t>
+              <w:t>11:15–11:45</w:t>
             </w:r>
           </w:p>
         </w:tc>
@@ -1895,7 +2011,7 @@
                 <w:b w:val="0"/>
                 <w:sz w:val="19"/>
               </w:rPr>
-              <w:t>75 min</w:t>
+              <w:t>30 min</w:t>
             </w:r>
           </w:p>
         </w:tc>
@@ -1912,7 +2028,57 @@
                 <w:b/>
                 <w:sz w:val="19"/>
               </w:rPr>
-              <w:t>Topic 1 (continued) — n8n fundamentals: what n8n is, hosting options, credentials, node types, trigger nodes, data-processing nodes, JSON and expressions, execution modes. Slides 37–46</w:t>
+              <w:t>Topic 1 (continued) — n8n fundamentals: trigger nodes, data-processing nodes, storage and app actions, JSON and expressions, test vs production executions, and credentials. Slides 37–46</w:t>
+            </w:r>
+          </w:p>
+        </w:tc>
+      </w:tr>
+      <w:tr>
+        <w:tc>
+          <w:tcPr>
+            <w:tcW w:type="dxa" w:w="1440"/>
+          </w:tcPr>
+          <w:p>
+            <w:r/>
+            <w:r>
+              <w:rPr>
+                <w:rFonts w:ascii="Arial" w:hAnsi="Arial"/>
+                <w:b w:val="0"/>
+                <w:sz w:val="19"/>
+              </w:rPr>
+              <w:t>11:45–12:30</w:t>
+            </w:r>
+          </w:p>
+        </w:tc>
+        <w:tc>
+          <w:tcPr>
+            <w:tcW w:type="dxa" w:w="1152"/>
+          </w:tcPr>
+          <w:p>
+            <w:r/>
+            <w:r>
+              <w:rPr>
+                <w:rFonts w:ascii="Arial" w:hAnsi="Arial"/>
+                <w:b w:val="0"/>
+                <w:sz w:val="19"/>
+              </w:rPr>
+              <w:t>45 min</w:t>
+            </w:r>
+          </w:p>
+        </w:tc>
+        <w:tc>
+          <w:tcPr>
+            <w:tcW w:type="dxa" w:w="7056"/>
+          </w:tcPr>
+          <w:p>
+            <w:r/>
+            <w:r>
+              <w:rPr>
+                <w:rFonts w:ascii="Arial" w:hAnsi="Arial"/>
+                <w:b w:val="0"/>
+                <w:sz w:val="19"/>
+              </w:rPr>
+              <w:t>Hands-on Lab 1 — n8n Trigger and Action (Event Flyer with QR Code): build the form-to-Gmail workflow, publish it, copy the form's Production URL and create a QR-code event flyer; present and scan-test the flyers. Slides 47–55</w:t>
             </w:r>
           </w:p>
         </w:tc>
@@ -1984,7 +2150,7 @@
                 <w:b/>
                 <w:sz w:val="19"/>
               </w:rPr>
-              <w:t>13:30–14:45</w:t>
+              <w:t>13:30–15:15</w:t>
             </w:r>
           </w:p>
         </w:tc>
@@ -2001,7 +2167,7 @@
                 <w:b w:val="0"/>
                 <w:sz w:val="19"/>
               </w:rPr>
-              <w:t>75 min</w:t>
+              <w:t>105 min</w:t>
             </w:r>
           </w:p>
         </w:tc>
@@ -2018,60 +2184,7 @@
                 <w:b/>
                 <w:sz w:val="19"/>
               </w:rPr>
-              <w:t>Topic 1 (continued) — AI agents: the four components (model, memory, tools, instructions), popular LLM providers, model parameters and temperature, instruction design with worked examples, and MCP. Slides 47–56</w:t>
-            </w:r>
-          </w:p>
-        </w:tc>
-      </w:tr>
-      <w:tr>
-        <w:tc>
-          <w:tcPr>
-            <w:tcW w:type="dxa" w:w="1440"/>
-            <w:shd w:val="clear" w:color="auto" w:fill="E8F0FE"/>
-          </w:tcPr>
-          <w:p>
-            <w:r/>
-            <w:r>
-              <w:rPr>
-                <w:rFonts w:ascii="Arial" w:hAnsi="Arial"/>
-                <w:b/>
-                <w:sz w:val="19"/>
-              </w:rPr>
-              <w:t>14:45–15:45</w:t>
-            </w:r>
-          </w:p>
-        </w:tc>
-        <w:tc>
-          <w:tcPr>
-            <w:tcW w:type="dxa" w:w="1152"/>
-            <w:shd w:val="clear" w:color="auto" w:fill="E8F0FE"/>
-          </w:tcPr>
-          <w:p>
-            <w:r/>
-            <w:r>
-              <w:rPr>
-                <w:rFonts w:ascii="Arial" w:hAnsi="Arial"/>
-                <w:b w:val="0"/>
-                <w:sz w:val="19"/>
-              </w:rPr>
-              <w:t>60 min</w:t>
-            </w:r>
-          </w:p>
-        </w:tc>
-        <w:tc>
-          <w:tcPr>
-            <w:tcW w:type="dxa" w:w="7056"/>
-            <w:shd w:val="clear" w:color="auto" w:fill="E8F0FE"/>
-          </w:tcPr>
-          <w:p>
-            <w:r/>
-            <w:r>
-              <w:rPr>
-                <w:rFonts w:ascii="Arial" w:hAnsi="Arial"/>
-                <w:b/>
-                <w:sz w:val="19"/>
-              </w:rPr>
-              <w:t>Topic 1 (continued) — Webhooks: the inbound URL, webhook vs HTTP Request, GET vs POST, Test vs Production URL, webhook configuration and structured output. Slides 57–64</w:t>
+              <w:t>Topic 1 (continued) — The building blocks of an AI agent, before Lab 2: the AI agent and its loop, the model (popular LLM providers, model parameters and temperature, claiming the free AI credits), tools and MCP, instructions with worked examples, memory, and structured output. Slides 57–69</w:t>
             </w:r>
           </w:p>
         </w:tc>
@@ -2090,7 +2203,7 @@
                 <w:b w:val="0"/>
                 <w:sz w:val="19"/>
               </w:rPr>
-              <w:t>15:45–16:00</w:t>
+              <w:t>15:15–15:30</w:t>
             </w:r>
           </w:p>
         </w:tc>
@@ -2133,6 +2246,24 @@
         <w:tc>
           <w:tcPr>
             <w:tcW w:type="dxa" w:w="1440"/>
+            <w:shd w:val="clear" w:color="auto" w:fill="E8F0FE"/>
+          </w:tcPr>
+          <w:p>
+            <w:r/>
+            <w:r>
+              <w:rPr>
+                <w:rFonts w:ascii="Arial" w:hAnsi="Arial"/>
+                <w:b/>
+                <w:sz w:val="19"/>
+              </w:rPr>
+              <w:t>15:30–16:15</w:t>
+            </w:r>
+          </w:p>
+        </w:tc>
+        <w:tc>
+          <w:tcPr>
+            <w:tcW w:type="dxa" w:w="1152"/>
+            <w:shd w:val="clear" w:color="auto" w:fill="E8F0FE"/>
           </w:tcPr>
           <w:p>
             <w:r/>
@@ -2142,39 +2273,24 @@
                 <w:b w:val="0"/>
                 <w:sz w:val="19"/>
               </w:rPr>
-              <w:t>16:00–17:00</w:t>
+              <w:t>45 min</w:t>
             </w:r>
           </w:p>
         </w:tc>
         <w:tc>
           <w:tcPr>
-            <w:tcW w:type="dxa" w:w="1152"/>
+            <w:tcW w:type="dxa" w:w="7056"/>
+            <w:shd w:val="clear" w:color="auto" w:fill="E8F0FE"/>
           </w:tcPr>
           <w:p>
             <w:r/>
             <w:r>
               <w:rPr>
                 <w:rFonts w:ascii="Arial" w:hAnsi="Arial"/>
-                <w:b w:val="0"/>
+                <w:b/>
                 <w:sz w:val="19"/>
               </w:rPr>
-              <w:t>60 min</w:t>
-            </w:r>
-          </w:p>
-        </w:tc>
-        <w:tc>
-          <w:tcPr>
-            <w:tcW w:type="dxa" w:w="7056"/>
-          </w:tcPr>
-          <w:p>
-            <w:r/>
-            <w:r>
-              <w:rPr>
-                <w:rFonts w:ascii="Arial" w:hAnsi="Arial"/>
-                <w:b w:val="0"/>
-                <w:sz w:val="19"/>
-              </w:rPr>
-              <w:t>Hands-on Lab 1 — n8n Trigger and Action (Event Flyer with QR Code). Slides 65–68</w:t>
+              <w:t>Topic 1 (continued) — Webhooks: the inbound URL, webhook vs HTTP Request, GET vs POST, Test vs Production URL and webhook configuration. Slides 70–76</w:t>
             </w:r>
           </w:p>
         </w:tc>
@@ -2192,7 +2308,7 @@
                 <w:b w:val="0"/>
                 <w:sz w:val="19"/>
               </w:rPr>
-              <w:t>17:00–18:15</w:t>
+              <w:t>16:15–18:15</w:t>
             </w:r>
           </w:p>
         </w:tc>
@@ -2208,7 +2324,7 @@
                 <w:b w:val="0"/>
                 <w:sz w:val="19"/>
               </w:rPr>
-              <w:t>75 min</w:t>
+              <w:t>120 min</w:t>
             </w:r>
           </w:p>
         </w:tc>
@@ -2224,7 +2340,7 @@
                 <w:b w:val="0"/>
                 <w:sz w:val="19"/>
               </w:rPr>
-              <w:t>Hands-on Lab 2 — Webhook and AI Agent (Marina Trust Bank Onboarding). Slides 69–71</w:t>
+              <w:t>Hands-on Lab 2 — Webhook and AI Agent (Marina Trust Bank Onboarding): how the webhook, agent, model, tools, instructions, memory and structured output fit together, then build and test the onboarding agent. Slides 77–81</w:t>
             </w:r>
           </w:p>
         </w:tc>
@@ -2436,7 +2552,7 @@
                 <w:b/>
                 <w:sz w:val="19"/>
               </w:rPr>
-              <w:t>9:45–11:00</w:t>
+              <w:t>9:45–10:30</w:t>
             </w:r>
           </w:p>
         </w:tc>
@@ -2453,7 +2569,7 @@
                 <w:b w:val="0"/>
                 <w:sz w:val="19"/>
               </w:rPr>
-              <w:t>75 min</w:t>
+              <w:t>45 min</w:t>
             </w:r>
           </w:p>
         </w:tc>
@@ -2470,7 +2586,57 @@
                 <w:b/>
                 <w:sz w:val="19"/>
               </w:rPr>
-              <w:t>Topic 2 — Agentic Chatbot and Human in the Loop: human in, on and out of the loop; how an approval suspends a running workflow; when a human belongs in the workflow; and guardrails. Slides 73–77</w:t>
+              <w:t>Topic 2 — Agentic Chatbot and Human in the Loop, before Lab 3: rule-based vs agentic workflows, designing a safe agentic chatbot, and a chatbot demo on Telegram — learners create a bot with BotFather /newbot, build an HR policy chatbot with n8n Assistant from one prompt, then connect, publish and chat with it. Slides 82–90</w:t>
+            </w:r>
+          </w:p>
+        </w:tc>
+      </w:tr>
+      <w:tr>
+        <w:tc>
+          <w:tcPr>
+            <w:tcW w:type="dxa" w:w="1440"/>
+          </w:tcPr>
+          <w:p>
+            <w:r/>
+            <w:r>
+              <w:rPr>
+                <w:rFonts w:ascii="Arial" w:hAnsi="Arial"/>
+                <w:b w:val="0"/>
+                <w:sz w:val="19"/>
+              </w:rPr>
+              <w:t>10:30–11:00</w:t>
+            </w:r>
+          </w:p>
+        </w:tc>
+        <w:tc>
+          <w:tcPr>
+            <w:tcW w:type="dxa" w:w="1152"/>
+          </w:tcPr>
+          <w:p>
+            <w:r/>
+            <w:r>
+              <w:rPr>
+                <w:rFonts w:ascii="Arial" w:hAnsi="Arial"/>
+                <w:b w:val="0"/>
+                <w:sz w:val="19"/>
+              </w:rPr>
+              <w:t>30 min</w:t>
+            </w:r>
+          </w:p>
+        </w:tc>
+        <w:tc>
+          <w:tcPr>
+            <w:tcW w:type="dxa" w:w="7056"/>
+          </w:tcPr>
+          <w:p>
+            <w:r/>
+            <w:r>
+              <w:rPr>
+                <w:rFonts w:ascii="Arial" w:hAnsi="Arial"/>
+                <w:b w:val="0"/>
+                <w:sz w:val="19"/>
+              </w:rPr>
+              <w:t>Hands-on Lab 3 — Chatbot Webhook (Investment Advisor): import the workflow, read the contact gate, the non-advisory rule and the FAQ, and deploy the chatbot behind the website. Slides 91–94</w:t>
             </w:r>
           </w:p>
         </w:tc>
@@ -2541,7 +2707,7 @@
                 <w:b w:val="0"/>
                 <w:sz w:val="19"/>
               </w:rPr>
-              <w:t>11:15–12:30</w:t>
+              <w:t>11:15–11:45</w:t>
             </w:r>
           </w:p>
         </w:tc>
@@ -2557,7 +2723,7 @@
                 <w:b w:val="0"/>
                 <w:sz w:val="19"/>
               </w:rPr>
-              <w:t>75 min</w:t>
+              <w:t>30 min</w:t>
             </w:r>
           </w:p>
         </w:tc>
@@ -2573,7 +2739,60 @@
                 <w:b w:val="0"/>
                 <w:sz w:val="19"/>
               </w:rPr>
-              <w:t>Hands-on Lab 3 — Chatbot Webhook (Investment Advisor): the contact gate and the four compliance probes. Slides 78–80</w:t>
+              <w:t>Hands-on Lab 3 — Chatbot Webhook (continued): test the contact gate and the four compliance probes, and debrief.</w:t>
+            </w:r>
+          </w:p>
+        </w:tc>
+      </w:tr>
+      <w:tr>
+        <w:tc>
+          <w:tcPr>
+            <w:tcW w:type="dxa" w:w="1440"/>
+            <w:shd w:val="clear" w:color="auto" w:fill="E8F0FE"/>
+          </w:tcPr>
+          <w:p>
+            <w:r/>
+            <w:r>
+              <w:rPr>
+                <w:rFonts w:ascii="Arial" w:hAnsi="Arial"/>
+                <w:b/>
+                <w:sz w:val="19"/>
+              </w:rPr>
+              <w:t>11:45–12:30</w:t>
+            </w:r>
+          </w:p>
+        </w:tc>
+        <w:tc>
+          <w:tcPr>
+            <w:tcW w:type="dxa" w:w="1152"/>
+            <w:shd w:val="clear" w:color="auto" w:fill="E8F0FE"/>
+          </w:tcPr>
+          <w:p>
+            <w:r/>
+            <w:r>
+              <w:rPr>
+                <w:rFonts w:ascii="Arial" w:hAnsi="Arial"/>
+                <w:b w:val="0"/>
+                <w:sz w:val="19"/>
+              </w:rPr>
+              <w:t>45 min</w:t>
+            </w:r>
+          </w:p>
+        </w:tc>
+        <w:tc>
+          <w:tcPr>
+            <w:tcW w:type="dxa" w:w="7056"/>
+            <w:shd w:val="clear" w:color="auto" w:fill="E8F0FE"/>
+          </w:tcPr>
+          <w:p>
+            <w:r/>
+            <w:r>
+              <w:rPr>
+                <w:rFonts w:ascii="Arial" w:hAnsi="Arial"/>
+                <w:b/>
+                <w:sz w:val="19"/>
+              </w:rPr>
+              <w:t>Topic 2 (continued) — Human in the loop and guardrails, before Lab 4: human in, on and out of the loop; how an approval suspends a running workflow; when a human belongs in the workflow; and guardrails. Slides 95–98</w:t>
             </w:r>
           </w:p>
         </w:tc>
@@ -2676,7 +2895,7 @@
                 <w:b w:val="0"/>
                 <w:sz w:val="19"/>
               </w:rPr>
-              <w:t>Hands-on Lab 4 — Human in the Loop (Client Rapport Assistant): the approve and decline paths. Slides 81–83</w:t>
+              <w:t>Hands-on Lab 4 — Human in the Loop (Client Rapport Assistant): the approve and decline paths. Slides 99–101</w:t>
             </w:r>
           </w:p>
         </w:tc>
@@ -2782,7 +3001,7 @@
                 <w:b/>
                 <w:sz w:val="19"/>
               </w:rPr>
-              <w:t>Topic 3 — Retrieval-Augmented Generation: why retrieval rather than a bigger prompt, the RAG pipeline, tokenization and embeddings, chunking, vector stores and grounding. Slides 85–93</w:t>
+              <w:t>Topic 3 — Retrieval-Augmented Generation: why retrieval rather than a bigger prompt, the RAG pipeline, tokenization and embeddings, chunking, vector stores and grounding. Slides 103–111</w:t>
             </w:r>
           </w:p>
         </w:tc>
@@ -2832,7 +3051,7 @@
                 <w:b w:val="0"/>
                 <w:sz w:val="19"/>
               </w:rPr>
-              <w:t>Hands-on Lab 5 — RAG Customer Care Chatbot (Cook &amp; Bake Academy): ingestion and the grounded chatbot. Slides 94–97</w:t>
+              <w:t>Hands-on Lab 5 — RAG Customer Care Chatbot (Cook &amp; Bake Academy): ingestion and the grounded chatbot. Slides 112–115</w:t>
             </w:r>
           </w:p>
         </w:tc>
@@ -2885,7 +3104,7 @@
                 <w:b w:val="0"/>
                 <w:sz w:val="19"/>
               </w:rPr>
-              <w:t>Course recap, taking it back to work, Q&amp;A. Slides 98–100</w:t>
+              <w:t>Course recap, taking it back to work, Q&amp;A. Slides 116–118</w:t>
             </w:r>
           </w:p>
         </w:tc>
@@ -3226,7 +3445,7 @@
                 <w:b w:val="0"/>
                 <w:sz w:val="19"/>
               </w:rPr>
-              <w:t>Slides 20–72</w:t>
+              <w:t>Slides 20–81</w:t>
             </w:r>
           </w:p>
         </w:tc>
@@ -3294,7 +3513,7 @@
                 <w:b w:val="0"/>
                 <w:sz w:val="19"/>
               </w:rPr>
-              <w:t>Slides 73–84</w:t>
+              <w:t>Slides 82–102</w:t>
             </w:r>
           </w:p>
         </w:tc>
@@ -3362,7 +3581,7 @@
                 <w:b w:val="0"/>
                 <w:sz w:val="19"/>
               </w:rPr>
-              <w:t>Slides 85–97</w:t>
+              <w:t>Slides 103–115</w:t>
             </w:r>
           </w:p>
         </w:tc>

</xml_diff>

<commit_message>
feat(courseware): v2.5 — real Lab 5 screenshots explained (ingestion, answering, live chat)
- Lab 5 now shows the real n8n ingestion and answering canvases, each
  right after its own workflow slide, with numbered explanation cards,
  plus a live Course Assistant conversation (typo still retrieves, fees
  quoted from the brochure, gap admitted instead of guessed).
- flow_shot gains a side-by-side layout for near-16:10 screenshots;
  n8n_shot may be a list (one per workflow); extras gain "annotated".
- Includes the v2.4 changes: Lab 4 workflow and site config, Guardrails
  node, GET webhook recipe example, Build with AI screen, Edge-safe PDFs,
  lab sites say Published.
- Deck carries no class password ("provided by your trainer in class").
- Superseded v2.3 deck removed from the index (kept in courseware/archive/).

Co-Authored-By: Claude Opus 5.5 <noreply@anthropic.com>
</commit_message>
<xml_diff>
--- a/courseware/LP-Agentic AI for Business Process Automation.docx
+++ b/courseware/LP-Agentic AI for Business Process Automation.docx
@@ -218,7 +218,7 @@
           <w:color w:val="1F6FEB"/>
           <w:sz w:val="24"/>
         </w:rPr>
-        <w:t>Version 2.3</w:t>
+        <w:t>Version 2.5</w:t>
       </w:r>
     </w:p>
     <w:p>
@@ -728,6 +728,122 @@
           </w:p>
         </w:tc>
       </w:tr>
+      <w:tr>
+        <w:tc>
+          <w:tcPr>
+            <w:tcW w:type="dxa" w:w="2160"/>
+          </w:tcPr>
+          <w:p>
+            <w:r/>
+            <w:r>
+              <w:rPr>
+                <w:sz w:val="19"/>
+              </w:rPr>
+              <w:t>2.4</w:t>
+            </w:r>
+          </w:p>
+        </w:tc>
+        <w:tc>
+          <w:tcPr>
+            <w:tcW w:type="dxa" w:w="2160"/>
+          </w:tcPr>
+          <w:p>
+            <w:r/>
+            <w:r>
+              <w:rPr>
+                <w:sz w:val="19"/>
+              </w:rPr>
+              <w:t>16 October 2026</w:t>
+            </w:r>
+          </w:p>
+        </w:tc>
+        <w:tc>
+          <w:tcPr>
+            <w:tcW w:type="dxa" w:w="2160"/>
+          </w:tcPr>
+          <w:p>
+            <w:r/>
+            <w:r>
+              <w:rPr>
+                <w:sz w:val="19"/>
+              </w:rPr>
+              <w:t>Real n8n screenshots added and explained: the Lab 4 approval workflow and the Lab 4 website with its lab configuration panel; n8n's Guardrails node (an input check and an output sanitiser) after the guardrails concept; a GET webhook example that publishes a recipe page, in the webhooks block before Lab 2; and the Build with AI start screen in the Telegram chatbot demo. PDFs made compatible with Microsoft Edge (the theme shadow LibreOffice exported as masked bitmaps is removed). Lab websites now say Published instead of the retired Active toggle.</w:t>
+            </w:r>
+          </w:p>
+        </w:tc>
+        <w:tc>
+          <w:tcPr>
+            <w:tcW w:type="dxa" w:w="2160"/>
+          </w:tcPr>
+          <w:p>
+            <w:r/>
+            <w:r>
+              <w:rPr>
+                <w:sz w:val="19"/>
+              </w:rPr>
+              <w:t>Dr. Alfred Ang</w:t>
+            </w:r>
+          </w:p>
+        </w:tc>
+      </w:tr>
+      <w:tr>
+        <w:tc>
+          <w:tcPr>
+            <w:tcW w:type="dxa" w:w="2160"/>
+          </w:tcPr>
+          <w:p>
+            <w:r/>
+            <w:r>
+              <w:rPr>
+                <w:sz w:val="19"/>
+              </w:rPr>
+              <w:t>2.5</w:t>
+            </w:r>
+          </w:p>
+        </w:tc>
+        <w:tc>
+          <w:tcPr>
+            <w:tcW w:type="dxa" w:w="2160"/>
+          </w:tcPr>
+          <w:p>
+            <w:r/>
+            <w:r>
+              <w:rPr>
+                <w:sz w:val="19"/>
+              </w:rPr>
+              <w:t>17 October 2026</w:t>
+            </w:r>
+          </w:p>
+        </w:tc>
+        <w:tc>
+          <w:tcPr>
+            <w:tcW w:type="dxa" w:w="2160"/>
+          </w:tcPr>
+          <w:p>
+            <w:r/>
+            <w:r>
+              <w:rPr>
+                <w:sz w:val="19"/>
+              </w:rPr>
+              <w:t>Real n8n screenshots added and explained for Lab 5: the ingestion workflow (fetch the brochures, split and embed, insert into the vector store) directly after the ingestion workflow slide, the answering workflow (webhook, agent and model, retrieval tool) directly after the answering workflow slide, and a live Course Assistant conversation showing a misspelt question still retrieving the right brochures, fees quoted from the brochure, and the assistant admitting a gap instead of inventing a fee. Notes that the ingestion and answering workflows must use the same embedding model and memory key whichever provider is used. Slide references updated.</w:t>
+            </w:r>
+          </w:p>
+        </w:tc>
+        <w:tc>
+          <w:tcPr>
+            <w:tcW w:type="dxa" w:w="2160"/>
+          </w:tcPr>
+          <w:p>
+            <w:r/>
+            <w:r>
+              <w:rPr>
+                <w:sz w:val="19"/>
+              </w:rPr>
+              <w:t>Dr. Alfred Ang</w:t>
+            </w:r>
+          </w:p>
+        </w:tc>
+      </w:tr>
     </w:tbl>
     <w:p>
       <w:pPr>
@@ -764,7 +880,7 @@
         </w:rPr>
         <w:t>Course Information</w:t>
         <w:tab/>
-        <w:t>6</w:t>
+        <w:t>7</w:t>
       </w:r>
     </w:p>
     <w:p>
@@ -783,7 +899,7 @@
         </w:rPr>
         <w:t>Learning Outcomes</w:t>
         <w:tab/>
-        <w:t>6</w:t>
+        <w:t>7</w:t>
       </w:r>
     </w:p>
     <w:p>
@@ -802,7 +918,7 @@
         </w:rPr>
         <w:t>Skills Framework Alignment</w:t>
         <w:tab/>
-        <w:t>6</w:t>
+        <w:t>7</w:t>
       </w:r>
     </w:p>
     <w:p>
@@ -821,7 +937,7 @@
         </w:rPr>
         <w:t>Assessment</w:t>
         <w:tab/>
-        <w:t>6</w:t>
+        <w:t>7</w:t>
       </w:r>
     </w:p>
     <w:p>
@@ -840,7 +956,7 @@
         </w:rPr>
         <w:t>Course Schedule</w:t>
         <w:tab/>
-        <w:t>7</w:t>
+        <w:t>8</w:t>
       </w:r>
     </w:p>
     <w:p>
@@ -860,7 +976,7 @@
         </w:rPr>
         <w:t>Day 1 — n8n, AI Agents and Agentic Chatbots</w:t>
         <w:tab/>
-        <w:t>7</w:t>
+        <w:t>8</w:t>
       </w:r>
     </w:p>
     <w:p>
@@ -880,7 +996,7 @@
         </w:rPr>
         <w:t>Day 2 — Human in the Loop, RAG and Assessment</w:t>
         <w:tab/>
-        <w:t>8</w:t>
+        <w:t>9</w:t>
       </w:r>
     </w:p>
     <w:p>
@@ -899,7 +1015,7 @@
         </w:rPr>
         <w:t>Lab Reference (aligned to topics and learning outcomes)</w:t>
         <w:tab/>
-        <w:t>10</w:t>
+        <w:t>11</w:t>
       </w:r>
     </w:p>
     <w:p>
@@ -2290,7 +2406,7 @@
                 <w:b/>
                 <w:sz w:val="19"/>
               </w:rPr>
-              <w:t>Topic 1 (continued) — Webhooks: the inbound URL, webhook vs HTTP Request, GET vs POST, Test vs Production URL and webhook configuration. Slides 70–76</w:t>
+              <w:t>Topic 1 (continued) — Webhooks: the inbound URL, webhook vs HTTP Request, GET vs POST, Test vs Production URL and webhook configuration. Slides 70–77</w:t>
             </w:r>
           </w:p>
         </w:tc>
@@ -2340,7 +2456,7 @@
                 <w:b w:val="0"/>
                 <w:sz w:val="19"/>
               </w:rPr>
-              <w:t>Hands-on Lab 2 — Webhook and AI Agent (Marina Trust Bank Onboarding): how the webhook, agent, model, tools, instructions, memory and structured output fit together, then build and test the onboarding agent. Slides 77–81</w:t>
+              <w:t>Hands-on Lab 2 — Webhook and AI Agent (Marina Trust Bank Onboarding): how the webhook, agent, model, tools, instructions, memory and structured output fit together, then build and test the onboarding agent. Slides 78–82</w:t>
             </w:r>
           </w:p>
         </w:tc>
@@ -2586,7 +2702,7 @@
                 <w:b/>
                 <w:sz w:val="19"/>
               </w:rPr>
-              <w:t>Topic 2 — Agentic Chatbot and Human in the Loop, before Lab 3: rule-based vs agentic workflows, designing a safe agentic chatbot, and a chatbot demo on Telegram — learners create a bot with BotFather /newbot, build an HR policy chatbot with n8n Assistant from one prompt, then connect, publish and chat with it. Slides 82–90</w:t>
+              <w:t>Topic 2 — Agentic Chatbot and Human in the Loop, before Lab 3: rule-based vs agentic workflows, designing a safe agentic chatbot, and a chatbot demo on Telegram — learners create a bot with BotFather /newbot, build an HR policy chatbot with n8n Assistant from one prompt, then connect, publish and chat with it. Slides 83–92</w:t>
             </w:r>
           </w:p>
         </w:tc>
@@ -2636,7 +2752,7 @@
                 <w:b w:val="0"/>
                 <w:sz w:val="19"/>
               </w:rPr>
-              <w:t>Hands-on Lab 3 — Chatbot Webhook (Investment Advisor): import the workflow, read the contact gate, the non-advisory rule and the FAQ, and deploy the chatbot behind the website. Slides 91–94</w:t>
+              <w:t>Hands-on Lab 3 — Chatbot Webhook (Investment Advisor): import the workflow, read the contact gate, the non-advisory rule and the FAQ, and deploy the chatbot behind the website. Slides 93–96</w:t>
             </w:r>
           </w:p>
         </w:tc>
@@ -2792,7 +2908,7 @@
                 <w:b/>
                 <w:sz w:val="19"/>
               </w:rPr>
-              <w:t>Topic 2 (continued) — Human in the loop and guardrails, before Lab 4: human in, on and out of the loop; how an approval suspends a running workflow; when a human belongs in the workflow; and guardrails. Slides 95–98</w:t>
+              <w:t>Topic 2 (continued) — Human in the loop and guardrails, before Lab 4: human in, on and out of the loop; how an approval suspends a running workflow; when a human belongs in the workflow; and guardrails. Slides 97–101</w:t>
             </w:r>
           </w:p>
         </w:tc>
@@ -2895,7 +3011,7 @@
                 <w:b w:val="0"/>
                 <w:sz w:val="19"/>
               </w:rPr>
-              <w:t>Hands-on Lab 4 — Human in the Loop (Client Rapport Assistant): the approve and decline paths. Slides 99–101</w:t>
+              <w:t>Hands-on Lab 4 — Human in the Loop (Client Rapport Assistant): the approve and decline paths. Slides 102–106</w:t>
             </w:r>
           </w:p>
         </w:tc>
@@ -3001,7 +3117,7 @@
                 <w:b/>
                 <w:sz w:val="19"/>
               </w:rPr>
-              <w:t>Topic 3 — Retrieval-Augmented Generation: why retrieval rather than a bigger prompt, the RAG pipeline, tokenization and embeddings, chunking, vector stores and grounding. Slides 103–111</w:t>
+              <w:t>Topic 3 — Retrieval-Augmented Generation: why retrieval rather than a bigger prompt, the RAG pipeline, tokenization and embeddings, chunking, vector stores and grounding. Slides 108–116</w:t>
             </w:r>
           </w:p>
         </w:tc>
@@ -3051,7 +3167,7 @@
                 <w:b w:val="0"/>
                 <w:sz w:val="19"/>
               </w:rPr>
-              <w:t>Hands-on Lab 5 — RAG Customer Care Chatbot (Cook &amp; Bake Academy): ingestion and the grounded chatbot. Slides 112–115</w:t>
+              <w:t>Hands-on Lab 5 — RAG Customer Care Chatbot (Cook &amp; Bake Academy): ingestion and the grounded chatbot. Slides 117–123</w:t>
             </w:r>
           </w:p>
         </w:tc>
@@ -3104,7 +3220,7 @@
                 <w:b w:val="0"/>
                 <w:sz w:val="19"/>
               </w:rPr>
-              <w:t>Course recap, taking it back to work, Q&amp;A. Slides 116–118</w:t>
+              <w:t>Course recap, taking it back to work, Q&amp;A. Slides 124–126</w:t>
             </w:r>
           </w:p>
         </w:tc>
@@ -3445,7 +3561,7 @@
                 <w:b w:val="0"/>
                 <w:sz w:val="19"/>
               </w:rPr>
-              <w:t>Slides 20–81</w:t>
+              <w:t>Slides 20–82</w:t>
             </w:r>
           </w:p>
         </w:tc>
@@ -3513,7 +3629,7 @@
                 <w:b w:val="0"/>
                 <w:sz w:val="19"/>
               </w:rPr>
-              <w:t>Slides 82–102</w:t>
+              <w:t>Slides 83–107</w:t>
             </w:r>
           </w:p>
         </w:tc>
@@ -3581,7 +3697,7 @@
                 <w:b w:val="0"/>
                 <w:sz w:val="19"/>
               </w:rPr>
-              <w:t>Slides 103–115</w:t>
+              <w:t>Slides 108–123</w:t>
             </w:r>
           </w:p>
         </w:tc>

</xml_diff>